<commit_message>
UAT doc: scope to customer role (maintain data + test), drop technical prerequisites
Replace the technical prerequisites section (DDIC/program/GUI-status/SM30
build - the SAP team's job) with a customer-scope section: maintain config
data, prepare CIS test scenarios, execute tests. Remove the authorization
test case (technical/security, not a business-process test).

Co-Authored-By: Claude Opus 4.8 <noreply@anthropic.com>
Claude-Session: https://claude.ai/code/session_01A3BJ7ydDq6e8VDbD1uvXUk
</commit_message>
<xml_diff>
--- a/CIS_2026_27_UAT_Test_Document.docx
+++ b/CIS_2026_27_UAT_Test_Document.docx
@@ -341,455 +341,54 @@
           <w:color w:val="1F3864"/>
           <w:sz w:val="26"/>
         </w:rPr>
-        <w:t>2. Prerequisites (before testing)</w:t>
+        <w:t>2. Customer scope</w:t>
       </w:r>
     </w:p>
-    <w:tbl>
-      <w:tblPr>
-        <w:tblStyle w:val="TableGrid"/>
-        <w:tblW w:type="auto" w:w="0"/>
-        <w:jc w:val="center"/>
-        <w:tblLook w:firstColumn="1" w:firstRow="1" w:lastColumn="0" w:lastRow="0" w:noHBand="0" w:noVBand="1" w:val="04A0"/>
-      </w:tblPr>
-      <w:tblGrid>
-        <w:gridCol w:w="2880"/>
-        <w:gridCol w:w="2880"/>
-        <w:gridCol w:w="2880"/>
-      </w:tblGrid>
-      <w:tr>
-        <w:tc>
-          <w:tcPr>
-            <w:tcW w:type="dxa" w:w="432"/>
-            <w:shd w:val="clear" w:fill="1F3864"/>
-          </w:tcPr>
-          <w:p>
-            <w:r/>
-            <w:r>
-              <w:rPr>
-                <w:b/>
-                <w:color w:val="FFFFFF"/>
-                <w:sz w:val="18"/>
-              </w:rPr>
-              <w:t>#</w:t>
-            </w:r>
-          </w:p>
-        </w:tc>
-        <w:tc>
-          <w:tcPr>
-            <w:tcW w:type="dxa" w:w="7488"/>
-            <w:shd w:val="clear" w:fill="1F3864"/>
-          </w:tcPr>
-          <w:p>
-            <w:r/>
-            <w:r>
-              <w:rPr>
-                <w:b/>
-                <w:color w:val="FFFFFF"/>
-                <w:sz w:val="18"/>
-              </w:rPr>
-              <w:t>Prerequisite</w:t>
-            </w:r>
-          </w:p>
-        </w:tc>
-        <w:tc>
-          <w:tcPr>
-            <w:tcW w:type="dxa" w:w="1440"/>
-            <w:shd w:val="clear" w:fill="1F3864"/>
-          </w:tcPr>
-          <w:p>
-            <w:r/>
-            <w:r>
-              <w:rPr>
-                <w:b/>
-                <w:color w:val="FFFFFF"/>
-                <w:sz w:val="18"/>
-              </w:rPr>
-              <w:t>Done (Y/N)</w:t>
-            </w:r>
-          </w:p>
-        </w:tc>
-      </w:tr>
-      <w:tr>
-        <w:tc>
-          <w:tcPr>
-            <w:tcW w:type="dxa" w:w="432"/>
-          </w:tcPr>
-          <w:p>
-            <w:r/>
-            <w:r>
-              <w:rPr>
-                <w:b w:val="0"/>
-                <w:sz w:val="18"/>
-              </w:rPr>
-              <w:t>1</w:t>
-            </w:r>
-          </w:p>
-        </w:tc>
-        <w:tc>
-          <w:tcPr>
-            <w:tcW w:type="dxa" w:w="7488"/>
-          </w:tcPr>
-          <w:p>
-            <w:r/>
-            <w:r>
-              <w:rPr>
-                <w:b w:val="0"/>
-                <w:sz w:val="18"/>
-              </w:rPr>
-              <w:t>DDIC objects imported &amp; active: 3 tables (YCIS_WAIVER_RULE, YCIS_SHORTFALL, YCIS_NODISC_GRD) + data elements/domains</w:t>
-            </w:r>
-          </w:p>
-        </w:tc>
-        <w:tc>
-          <w:tcPr>
-            <w:tcW w:type="dxa" w:w="1440"/>
-          </w:tcPr>
-          <w:p>
-            <w:r/>
-            <w:r>
-              <w:rPr>
-                <w:b w:val="0"/>
-                <w:sz w:val="18"/>
-              </w:rPr>
-            </w:r>
-          </w:p>
-        </w:tc>
-      </w:tr>
-      <w:tr>
-        <w:tc>
-          <w:tcPr>
-            <w:tcW w:type="dxa" w:w="432"/>
-            <w:shd w:val="clear" w:fill="F2F5FA"/>
-          </w:tcPr>
-          <w:p>
-            <w:r/>
-            <w:r>
-              <w:rPr>
-                <w:b w:val="0"/>
-                <w:sz w:val="18"/>
-              </w:rPr>
-              <w:t>2</w:t>
-            </w:r>
-          </w:p>
-        </w:tc>
-        <w:tc>
-          <w:tcPr>
-            <w:tcW w:type="dxa" w:w="7488"/>
-            <w:shd w:val="clear" w:fill="F2F5FA"/>
-          </w:tcPr>
-          <w:p>
-            <w:r/>
-            <w:r>
-              <w:rPr>
-                <w:b w:val="0"/>
-                <w:sz w:val="18"/>
-              </w:rPr>
-              <w:t>Programs active: YRVG004_QAIS_EXECUTE_N1 and YCIS_REBATE_REPORT</w:t>
-            </w:r>
-          </w:p>
-        </w:tc>
-        <w:tc>
-          <w:tcPr>
-            <w:tcW w:type="dxa" w:w="1440"/>
-            <w:shd w:val="clear" w:fill="F2F5FA"/>
-          </w:tcPr>
-          <w:p>
-            <w:r/>
-            <w:r>
-              <w:rPr>
-                <w:b w:val="0"/>
-                <w:sz w:val="18"/>
-              </w:rPr>
-            </w:r>
-          </w:p>
-        </w:tc>
-      </w:tr>
-      <w:tr>
-        <w:tc>
-          <w:tcPr>
-            <w:tcW w:type="dxa" w:w="432"/>
-          </w:tcPr>
-          <w:p>
-            <w:r/>
-            <w:r>
-              <w:rPr>
-                <w:b w:val="0"/>
-                <w:sz w:val="18"/>
-              </w:rPr>
-              <w:t>3</w:t>
-            </w:r>
-          </w:p>
-        </w:tc>
-        <w:tc>
-          <w:tcPr>
-            <w:tcW w:type="dxa" w:w="7488"/>
-          </w:tcPr>
-          <w:p>
-            <w:r/>
-            <w:r>
-              <w:rPr>
-                <w:b w:val="0"/>
-                <w:sz w:val="18"/>
-              </w:rPr>
-              <w:t>GUI status STANDARD copied into YRVG004_QAIS_EXECUTE_N1 (from original YRVG004_QAIS_EXECUTE)</w:t>
-            </w:r>
-          </w:p>
-        </w:tc>
-        <w:tc>
-          <w:tcPr>
-            <w:tcW w:type="dxa" w:w="1440"/>
-          </w:tcPr>
-          <w:p>
-            <w:r/>
-            <w:r>
-              <w:rPr>
-                <w:b w:val="0"/>
-                <w:sz w:val="18"/>
-              </w:rPr>
-            </w:r>
-          </w:p>
-        </w:tc>
-      </w:tr>
-      <w:tr>
-        <w:tc>
-          <w:tcPr>
-            <w:tcW w:type="dxa" w:w="432"/>
-            <w:shd w:val="clear" w:fill="F2F5FA"/>
-          </w:tcPr>
-          <w:p>
-            <w:r/>
-            <w:r>
-              <w:rPr>
-                <w:b w:val="0"/>
-                <w:sz w:val="18"/>
-              </w:rPr>
-              <w:t>4</w:t>
-            </w:r>
-          </w:p>
-        </w:tc>
-        <w:tc>
-          <w:tcPr>
-            <w:tcW w:type="dxa" w:w="7488"/>
-            <w:shd w:val="clear" w:fill="F2F5FA"/>
-          </w:tcPr>
-          <w:p>
-            <w:r/>
-            <w:r>
-              <w:rPr>
-                <w:b w:val="0"/>
-                <w:sz w:val="18"/>
-              </w:rPr>
-              <w:t>SM30 table maintenance generated for the 3 config tables</w:t>
-            </w:r>
-          </w:p>
-        </w:tc>
-        <w:tc>
-          <w:tcPr>
-            <w:tcW w:type="dxa" w:w="1440"/>
-            <w:shd w:val="clear" w:fill="F2F5FA"/>
-          </w:tcPr>
-          <w:p>
-            <w:r/>
-            <w:r>
-              <w:rPr>
-                <w:b w:val="0"/>
-                <w:sz w:val="18"/>
-              </w:rPr>
-            </w:r>
-          </w:p>
-        </w:tc>
-      </w:tr>
-      <w:tr>
-        <w:tc>
-          <w:tcPr>
-            <w:tcW w:type="dxa" w:w="432"/>
-          </w:tcPr>
-          <w:p>
-            <w:r/>
-            <w:r>
-              <w:rPr>
-                <w:b w:val="0"/>
-                <w:sz w:val="18"/>
-              </w:rPr>
-              <w:t>5</w:t>
-            </w:r>
-          </w:p>
-        </w:tc>
-        <w:tc>
-          <w:tcPr>
-            <w:tcW w:type="dxa" w:w="7488"/>
-          </w:tcPr>
-          <w:p>
-            <w:r/>
-            <w:r>
-              <w:rPr>
-                <w:b w:val="0"/>
-                <w:sz w:val="18"/>
-              </w:rPr>
-              <w:t>Authorization: tester has YV_VKBUR authorization for the sales office(s) used</w:t>
-            </w:r>
-          </w:p>
-        </w:tc>
-        <w:tc>
-          <w:tcPr>
-            <w:tcW w:type="dxa" w:w="1440"/>
-          </w:tcPr>
-          <w:p>
-            <w:r/>
-            <w:r>
-              <w:rPr>
-                <w:b w:val="0"/>
-                <w:sz w:val="18"/>
-              </w:rPr>
-            </w:r>
-          </w:p>
-        </w:tc>
-      </w:tr>
-      <w:tr>
-        <w:tc>
-          <w:tcPr>
-            <w:tcW w:type="dxa" w:w="432"/>
-            <w:shd w:val="clear" w:fill="F2F5FA"/>
-          </w:tcPr>
-          <w:p>
-            <w:r/>
-            <w:r>
-              <w:rPr>
-                <w:b w:val="0"/>
-                <w:sz w:val="18"/>
-              </w:rPr>
-              <w:t>6</w:t>
-            </w:r>
-          </w:p>
-        </w:tc>
-        <w:tc>
-          <w:tcPr>
-            <w:tcW w:type="dxa" w:w="7488"/>
-            <w:shd w:val="clear" w:fill="F2F5FA"/>
-          </w:tcPr>
-          <w:p>
-            <w:r/>
-            <w:r>
-              <w:rPr>
-                <w:b w:val="0"/>
-                <w:sz w:val="18"/>
-              </w:rPr>
-              <w:t>CIS master data exists in YRVA_QAIS_DATA with YY_CUSCLASS populated (Actual User / TRADER)</w:t>
-            </w:r>
-          </w:p>
-        </w:tc>
-        <w:tc>
-          <w:tcPr>
-            <w:tcW w:type="dxa" w:w="1440"/>
-            <w:shd w:val="clear" w:fill="F2F5FA"/>
-          </w:tcPr>
-          <w:p>
-            <w:r/>
-            <w:r>
-              <w:rPr>
-                <w:b w:val="0"/>
-                <w:sz w:val="18"/>
-              </w:rPr>
-            </w:r>
-          </w:p>
-        </w:tc>
-      </w:tr>
-      <w:tr>
-        <w:tc>
-          <w:tcPr>
-            <w:tcW w:type="dxa" w:w="432"/>
-          </w:tcPr>
-          <w:p>
-            <w:r/>
-            <w:r>
-              <w:rPr>
-                <w:b w:val="0"/>
-                <w:sz w:val="18"/>
-              </w:rPr>
-              <w:t>7</w:t>
-            </w:r>
-          </w:p>
-        </w:tc>
-        <w:tc>
-          <w:tcPr>
-            <w:tcW w:type="dxa" w:w="7488"/>
-          </w:tcPr>
-          <w:p>
-            <w:r/>
-            <w:r>
-              <w:rPr>
-                <w:b w:val="0"/>
-                <w:sz w:val="18"/>
-              </w:rPr>
-              <w:t>Signed grades/materials maintained in YRVA_QAIS_TNTLFT for the test CIS</w:t>
-            </w:r>
-          </w:p>
-        </w:tc>
-        <w:tc>
-          <w:tcPr>
-            <w:tcW w:type="dxa" w:w="1440"/>
-          </w:tcPr>
-          <w:p>
-            <w:r/>
-            <w:r>
-              <w:rPr>
-                <w:b w:val="0"/>
-                <w:sz w:val="18"/>
-              </w:rPr>
-            </w:r>
-          </w:p>
-        </w:tc>
-      </w:tr>
-      <w:tr>
-        <w:tc>
-          <w:tcPr>
-            <w:tcW w:type="dxa" w:w="432"/>
-            <w:shd w:val="clear" w:fill="F2F5FA"/>
-          </w:tcPr>
-          <w:p>
-            <w:r/>
-            <w:r>
-              <w:rPr>
-                <w:b w:val="0"/>
-                <w:sz w:val="18"/>
-              </w:rPr>
-              <w:t>8</w:t>
-            </w:r>
-          </w:p>
-        </w:tc>
-        <w:tc>
-          <w:tcPr>
-            <w:tcW w:type="dxa" w:w="7488"/>
-            <w:shd w:val="clear" w:fill="F2F5FA"/>
-          </w:tcPr>
-          <w:p>
-            <w:r/>
-            <w:r>
-              <w:rPr>
-                <w:b w:val="0"/>
-                <w:sz w:val="18"/>
-              </w:rPr>
-              <w:t>Billing/lifting data (S922) exists for the test customers &amp; period</w:t>
-            </w:r>
-          </w:p>
-        </w:tc>
-        <w:tc>
-          <w:tcPr>
-            <w:tcW w:type="dxa" w:w="1440"/>
-            <w:shd w:val="clear" w:fill="F2F5FA"/>
-          </w:tcPr>
-          <w:p>
-            <w:r/>
-            <w:r>
-              <w:rPr>
-                <w:b w:val="0"/>
-                <w:sz w:val="18"/>
-              </w:rPr>
-            </w:r>
-          </w:p>
-        </w:tc>
-      </w:tr>
-    </w:tbl>
+    <w:p>
+      <w:r>
+        <w:rPr>
+          <w:i w:val="0"/>
+          <w:sz w:val="20"/>
+        </w:rPr>
+        <w:t>The technical build — creating the tables, programs, GUI status and SM30 maintenance views — is completed by the SAP team and is NOT part of testing. The business team’s role in UAT is simply to:</w:t>
+      </w:r>
+    </w:p>
+    <w:p>
+      <w:pPr>
+        <w:pStyle w:val="ListBullet"/>
+      </w:pPr>
+      <w:r>
+        <w:rPr>
+          <w:i w:val="0"/>
+          <w:sz w:val="20"/>
+        </w:rPr>
+        <w:t>Maintain the required data in the CIS configuration tables (Section 3), via SM30.</w:t>
+      </w:r>
+    </w:p>
+    <w:p>
+      <w:pPr>
+        <w:pStyle w:val="ListBullet"/>
+      </w:pPr>
+      <w:r>
+        <w:rPr>
+          <w:i w:val="0"/>
+          <w:sz w:val="20"/>
+        </w:rPr>
+        <w:t>Prepare the test scenarios through the normal CIS process — create the CIS number, enter the signed grades, and ensure lifting/billing exists for the test customers and period.</w:t>
+      </w:r>
+    </w:p>
+    <w:p>
+      <w:pPr>
+        <w:pStyle w:val="ListBullet"/>
+      </w:pPr>
+      <w:r>
+        <w:rPr>
+          <w:i w:val="0"/>
+          <w:sz w:val="20"/>
+        </w:rPr>
+        <w:t>Execute the test cases (Section 4), compare actual vs expected, and record Pass/Fail.</w:t>
+      </w:r>
+    </w:p>
     <w:p>
       <w:r>
         <w:rPr>
@@ -797,7 +396,7 @@
           <w:color w:val="1F3864"/>
           <w:sz w:val="26"/>
         </w:rPr>
-        <w:t>3. Test data setup (config tables)</w:t>
+        <w:t>3. Data to be maintained by the business (config tables)</w:t>
       </w:r>
     </w:p>
     <w:p>
@@ -3253,102 +2852,6 @@
           </w:p>
         </w:tc>
       </w:tr>
-      <w:tr>
-        <w:tc>
-          <w:tcPr>
-            <w:tcW w:type="dxa" w:w="720"/>
-            <w:shd w:val="clear" w:fill="F2F5FA"/>
-          </w:tcPr>
-          <w:p>
-            <w:r/>
-            <w:r>
-              <w:rPr>
-                <w:b w:val="0"/>
-                <w:sz w:val="16"/>
-              </w:rPr>
-              <w:t>TC-18</w:t>
-            </w:r>
-          </w:p>
-        </w:tc>
-        <w:tc>
-          <w:tcPr>
-            <w:tcW w:type="dxa" w:w="1656"/>
-            <w:shd w:val="clear" w:fill="F2F5FA"/>
-          </w:tcPr>
-          <w:p>
-            <w:r/>
-            <w:r>
-              <w:rPr>
-                <w:b w:val="0"/>
-                <w:sz w:val="16"/>
-              </w:rPr>
-              <w:t>Authorization</w:t>
-            </w:r>
-          </w:p>
-        </w:tc>
-        <w:tc>
-          <w:tcPr>
-            <w:tcW w:type="dxa" w:w="3384"/>
-            <w:shd w:val="clear" w:fill="F2F5FA"/>
-          </w:tcPr>
-          <w:p>
-            <w:r/>
-            <w:r>
-              <w:rPr>
-                <w:b w:val="0"/>
-                <w:sz w:val="16"/>
-              </w:rPr>
-              <w:t>Run for a sales office the tester is NOT authorized for.</w:t>
-            </w:r>
-          </w:p>
-        </w:tc>
-        <w:tc>
-          <w:tcPr>
-            <w:tcW w:type="dxa" w:w="3096"/>
-            <w:shd w:val="clear" w:fill="F2F5FA"/>
-          </w:tcPr>
-          <w:p>
-            <w:r/>
-            <w:r>
-              <w:rPr>
-                <w:b w:val="0"/>
-                <w:sz w:val="16"/>
-              </w:rPr>
-              <w:t>Authorization error message (YV_VKBUR).</w:t>
-            </w:r>
-          </w:p>
-        </w:tc>
-        <w:tc>
-          <w:tcPr>
-            <w:tcW w:type="dxa" w:w="648"/>
-            <w:shd w:val="clear" w:fill="F2F5FA"/>
-          </w:tcPr>
-          <w:p>
-            <w:r/>
-            <w:r>
-              <w:rPr>
-                <w:b w:val="0"/>
-                <w:sz w:val="16"/>
-              </w:rPr>
-            </w:r>
-          </w:p>
-        </w:tc>
-        <w:tc>
-          <w:tcPr>
-            <w:tcW w:type="dxa" w:w="1296"/>
-            <w:shd w:val="clear" w:fill="F2F5FA"/>
-          </w:tcPr>
-          <w:p>
-            <w:r/>
-            <w:r>
-              <w:rPr>
-                <w:b w:val="0"/>
-                <w:sz w:val="16"/>
-              </w:rPr>
-            </w:r>
-          </w:p>
-        </w:tc>
-      </w:tr>
     </w:tbl>
     <w:p>
       <w:r>

</xml_diff>